<commit_message>
Rewrite section 3.2 opening transition: add concise bridging paragraph between problem formulation (3.1) and framework overview
Co-authored-by: Y <Yajoker@users.noreply.github.com>
</commit_message>
<xml_diff>
--- a/Event-Triggered Hierarchical Reinforcement Learning for Mapless Navigation in Unknown Dynamic Environments_v3.docx
+++ b/Event-Triggered Hierarchical Reinforcement Learning for Mapless Navigation in Unknown Dynamic Environments_v3.docx
@@ -6296,6 +6296,24 @@
           <w:color w:val="000000" w:themeColor="text1"/>
         </w:rPr>
         <w:t>框架概述</w:t>
+      </w:r>
+    </w:p>
+    <w:p>
+      <w:pPr>
+        <w:ind w:firstLine="420"/>
+        <w:rPr>
+          <w:rFonts w:ascii="宋体" w:eastAsia="宋体" w:hAnsi="宋体" w:hint="eastAsia"/>
+          <w:sz w:val="24"/>
+          <w:szCs w:val="24"/>
+        </w:rPr>
+      </w:pPr>
+      <w:r>
+        <w:rPr>
+          <w:rFonts w:ascii="宋体" w:eastAsia="宋体" w:hAnsi="宋体" w:hint="eastAsia"/>
+          <w:sz w:val="24"/>
+          <w:szCs w:val="24"/>
+        </w:rPr>
+        <w:t xml:space="preserve">上述问题定义表明，未知动态环境下的无图导航具有部分可观测性强、长程目标推进与局部避障相互耦合、动态风险需实时响应等特征，这些特征使得单层策略难以在统一时间尺度上兼顾目标规划与连续控制。3.1 节已将该问题重构为高层 SMDP 与低层 MDP 相结合的分层决策形式，但分层结构要实际发挥作用，还需要解决两个关键问题：高层在何种条件下触发子目标更新，以及如何从局部观测中生成并评估候选子目标。为此，本文构建了一个以事件触发机制驱动高层重规划、以目标条件策略实现低层连续控制的分层强化学习导航框架。</w:t>
       </w:r>
     </w:p>
     <w:p>

</xml_diff>